<commit_message>
Add 2026 Cancer Research Network EMCR Outstanding Publication Award
Awarded for the ProCanFDL paper (Cai et al., Cancer Discovery, 2025).

- Add the award to the top of the Awards and honours list on the About
  page, mirrored in the zh-CN strings
- Add the same entry to the CV docx under Awards and honours, re-export
  the PDF from Word (still 5 pages, page breaks unchanged) and resync
  the served copy
- Bump site.cv.lastUpdated to 2026-10

Co-Authored-By: Claude Opus 5.5 <noreply@anthropic.com>
</commit_message>
<xml_diff>
--- a/docs/Zhaoxiang_Cai_CV_research.docx
+++ b/docs/Zhaoxiang_Cai_CV_research.docx
@@ -2097,6 +2097,76 @@
         <w:gridCol w:w="1900"/>
         <w:gridCol w:w="8006"/>
       </w:tblGrid>
+      <w:tr>
+        <w:tblPrEx>
+          <w:tblCellMar>
+            <w:top w:w="0" w:type="dxa"/>
+            <w:bottom w:w="0" w:type="dxa"/>
+          </w:tblCellMar>
+        </w:tblPrEx>
+        <w:trPr>
+          <w:cantSplit/>
+        </w:trPr>
+        <w:tc>
+          <w:tcPr>
+            <w:tcW w:w="1900" w:type="dxa"/>
+            <w:tcBorders>
+              <w:top w:val="none" w:sz="0" w:space="0" w:color="FFFFFF"/>
+              <w:left w:val="none" w:sz="0" w:space="0" w:color="FFFFFF"/>
+              <w:bottom w:val="none" w:sz="0" w:space="0" w:color="FFFFFF"/>
+              <w:right w:val="none" w:sz="0" w:space="0" w:color="FFFFFF"/>
+            </w:tcBorders>
+            <w:tcMar>
+              <w:top w:w="0" w:type="dxa"/>
+              <w:left w:w="0" w:type="dxa"/>
+              <w:bottom w:w="70" w:type="dxa"/>
+              <w:right w:w="120" w:type="dxa"/>
+            </w:tcMar>
+          </w:tcPr>
+          <w:p>
+            <w:pPr>
+              <w:spacing w:line="264" w:lineRule="auto"/>
+            </w:pPr>
+            <w:r>
+              <w:rPr>
+                <w:color w:val="5F6B7A"/>
+                <w:sz w:val="18"/>
+                <w:szCs w:val="18"/>
+              </w:rPr>
+              <w:t>2026</w:t>
+            </w:r>
+          </w:p>
+        </w:tc>
+        <w:tc>
+          <w:tcPr>
+            <w:tcW w:w="8006" w:type="dxa"/>
+            <w:tcBorders>
+              <w:top w:val="none" w:sz="0" w:space="0" w:color="FFFFFF"/>
+              <w:left w:val="none" w:sz="0" w:space="0" w:color="FFFFFF"/>
+              <w:bottom w:val="none" w:sz="0" w:space="0" w:color="FFFFFF"/>
+              <w:right w:val="none" w:sz="0" w:space="0" w:color="FFFFFF"/>
+            </w:tcBorders>
+            <w:tcMar>
+              <w:top w:w="0" w:type="dxa"/>
+              <w:left w:w="0" w:type="dxa"/>
+              <w:bottom w:w="70" w:type="dxa"/>
+              <w:right w:w="0" w:type="dxa"/>
+            </w:tcMar>
+          </w:tcPr>
+          <w:p>
+            <w:pPr>
+              <w:spacing w:line="252" w:lineRule="auto"/>
+            </w:pPr>
+            <w:r>
+              <w:rPr>
+                <w:sz w:val="19"/>
+                <w:szCs w:val="19"/>
+              </w:rPr>
+              <w:t>Cancer Research Network EMCR Outstanding Publication Award (Cai et al., Cancer Discovery, 2025)</w:t>
+            </w:r>
+          </w:p>
+        </w:tc>
+      </w:tr>
       <w:tr>
         <w:tblPrEx>
           <w:tblCellMar>

</xml_diff>

<commit_message>
Refresh CVs and citation metrics; add 2-page short CV
- Add a 2-page short research CV (no career profile, selected
  publications only)
- Both CVs: name heading "Zhaoxiang Cai" with preferred name noted
  beside it, current website URL, CINSW Early Career Fellow title,
  CMRI contact email
- Google Scholar refresh (Oct 2026): 1,273 citations, h-index 9,
  i10-index 8, on the site and in both CVs

Co-Authored-By: Claude Opus 5.5 <noreply@anthropic.com>
</commit_message>
<xml_diff>
--- a/docs/Zhaoxiang_Cai_CV_research.docx
+++ b/docs/Zhaoxiang_Cai_CV_research.docx
@@ -15,7 +15,15 @@
           <w:sz w:val="56"/>
           <w:szCs w:val="56"/>
         </w:rPr>
-        <w:t>Zhaoxiang (Simon) Cai</w:t>
+        <w:t>Zhaoxiang Cai</w:t>
+      </w:r>
+      <w:r>
+        <w:rPr>
+          <w:color w:val="5F6B7A"/>
+          <w:sz w:val="18"/>
+          <w:szCs w:val="18"/>
+        </w:rPr>
+        <w:t xml:space="preserve">   Preferred name: Simon</w:t>
       </w:r>
     </w:p>
     <w:p>
@@ -54,7 +62,7 @@
         <w:spacing w:line="264" w:lineRule="auto"/>
       </w:pPr>
       <w:r>
-        <w:t>Senior Data Scientist (Cancer Data Science), Children’s Medical Research Institute</w:t>
+        <w:t xml:space="preserve">CINSW Early Career Fellow  ·  Senior Data Scientist (Cancer Data Science), Children’s Medical Research Institute</w:t>
       </w:r>
     </w:p>
     <w:p>
@@ -91,7 +99,7 @@
           <w:sz w:val="18"/>
           <w:szCs w:val="18"/>
         </w:rPr>
-        <w:t>zhaoxiang.cai@hotmail.com</w:t>
+        <w:t xml:space="preserve">scai@cmri.org.au</w:t>
       </w:r>
       <w:r>
         <w:rPr>
@@ -109,7 +117,7 @@
             <w:szCs w:val="18"/>
             <w:u w:val="single"/>
           </w:rPr>
-          <w:t>zhaoxiangsimoncai.github.io/SimonCaiCV.io</w:t>
+          <w:t xml:space="preserve">zhaoxiangsimoncai.github.io</w:t>
         </w:r>
       </w:hyperlink>
       <w:r>
@@ -179,7 +187,7 @@
         <w:spacing w:after="90" w:line="264" w:lineRule="auto"/>
       </w:pPr>
       <w:r>
-        <w:t>In 2025, I was awarded a Cancer Institute NSW Early Career Fellowship ($597,732 over three years) to develop proteomic foundation models integrated with federated learning for multi-hospital cancer research. My work to date has generated over 1,160 citations (h-index: 8) and I have contributed to more than $2.59 million in competitive research funding. I am driven by the goal of translating advanced computational methods into practical tools that improve cancer diagnosis and prognosis through precision medicine.</w:t>
+        <w:t xml:space="preserve">In 2025, I was awarded a Cancer Institute NSW Early Career Fellowship ($597,732 over three years) to develop proteomic foundation models integrated with federated learning for multi-hospital cancer research. My work to date has generated over 1,270 citations (h-index: 9) and I have contributed to more than $2.59 million in competitive research funding. I am driven by the goal of translating advanced computational methods into practical tools that improve cancer diagnosis and prognosis through precision medicine.</w:t>
       </w:r>
     </w:p>
     <w:p/>
@@ -250,7 +258,7 @@
                 <w:sz w:val="40"/>
                 <w:szCs w:val="40"/>
               </w:rPr>
-              <w:t>1,166</w:t>
+              <w:t xml:space="preserve">1,273</w:t>
             </w:r>
           </w:p>
           <w:p>
@@ -321,7 +329,7 @@
                 <w:sz w:val="40"/>
                 <w:szCs w:val="40"/>
               </w:rPr>
-              <w:t>8</w:t>
+              <w:t>9</w:t>
             </w:r>
           </w:p>
           <w:p>
@@ -7368,7 +7376,7 @@
         <w:sz w:val="15"/>
         <w:szCs w:val="15"/>
       </w:rPr>
-      <w:t>Zhaoxiang (Simon) Cai  ·  Curriculum Vitae</w:t>
+      <w:t>Zhaoxiang Cai  ·  Curriculum Vitae</w:t>
     </w:r>
     <w:r>
       <w:rPr>

</xml_diff>